<commit_message>
build: fijar la versión de Forge para 1.20.1
Queda 47.4.10, la recomendada según la página oficial de descargas. El
dato viene de una búsqueda y no de consultar el repositorio Maven, que
este entorno no alcanza, así que el comentario deja dicho dónde
confirmarlo si Gradle no la encuentra.

Saca de encima el único paso manual que quedaba antes de poder compilar.
Guía y README actualizados en consecuencia.

Co-Authored-By: Claude Opus 5 <noreply@anthropic.com>
Claude-Session: https://claude.ai/code/session_01ND65wgpcS7H9DHzQWDAZ3a
</commit_message>
<xml_diff>
--- a/docs/Atmosia_Guia_de_Prueba.docx
+++ b/docs/Atmosia_Guia_de_Prueba.docx
@@ -177,7 +177,7 @@
                 <w:sz w:val="20"/>
                 <w:szCs w:val="20"/>
               </w:rPr>
-              <w:t xml:space="preserve">Dalo por hecho: la primera compilación va a fallar en algo. Los puntos donde la API de 1.20.1 hay que confirmarla están marcados con VERIFICAR en el código, y la versión de Forge quedó como REEMPLAZAR en vez de un número puesto de memoria.</w:t>
+              <w:t xml:space="preserve">Dalo por hecho: la primera compilación va a fallar en algo. Los puntos donde la API de 1.20.1 hay que confirmarla están marcados con VERIFICAR en el código.</w:t>
             </w:r>
           </w:p>
           <w:p>
@@ -868,7 +868,7 @@
           <w:sz w:val="21"/>
           <w:szCs w:val="21"/>
         </w:rPr>
-        <w:t xml:space="preserve">Abrir gradle.properties y reemplazar forge_version=REEMPLAZAR por la versión exacta de Forge para 1.20.1 (la recomendada de files.minecraftforge.net, rama 47.x). Este es el único valor que hay que completar a mano.</w:t>
+        <w:t xml:space="preserve">Compilar: ./gradlew build (en Windows, gradlew.bat build). La primera vez descarga el MDK entero y tarda varios minutos. Si falla, guardá el error tal cual: es información útil, no un problema tuyo.</w:t>
       </w:r>
     </w:p>
     <w:p>
@@ -886,7 +886,7 @@
           <w:sz w:val="21"/>
           <w:szCs w:val="21"/>
         </w:rPr>
-        <w:t xml:space="preserve">Compilar: ./gradlew build (en Windows, gradlew.bat build). Si falla, guardá el error tal cual: es información útil, no un problema tuyo.</w:t>
+        <w:t xml:space="preserve">Si Gradle no encuentra la versión de Forge, corregir forge_version en gradle.properties con la recomendada de files.minecraftforge.net para 1.20.1. Viene puesta la 47.4.10, tomada de una búsqueda y no del repositorio Maven, así que puede necesitar ajuste.</w:t>
       </w:r>
     </w:p>
     <w:p>

</xml_diff>